<commit_message>
Trim Welcome Checklist and fix header/footer borders
Remove the Quick Questions and What's Already Handled sections, keep
Google Ads and GBP access items, and constrain the header table to no
borders so only the intended bottom rule shows.

Co-Authored-By: Claude Sonnet 5 <noreply@anthropic.com>
Claude-Session: https://claude.ai/code/session_01QbfoJzAMUtfZAoDRG5QhTZ
</commit_message>
<xml_diff>
--- a/SEO-Clients-Hub/clients/Maxwell Plumbing & Drain/MPD-Welcome-Checklist.docx
+++ b/SEO-Clients-Hub/clients/Maxwell Plumbing & Drain/MPD-Welcome-Checklist.docx
@@ -555,212 +555,6 @@
         <w:t xml:space="preserve">  —  or just be ready to add a DNS TXT record when we send you one — this is usually only needed once or twice for verification</w:t>
       </w:r>
     </w:p>
-    <w:p>
-      <w:pPr>
-        <w:pStyle w:val="Heading1"/>
-        <w:pBdr>
-          <w:bottom w:val="single" w:color="453C79" w:sz="6" w:space="6"/>
-        </w:pBdr>
-        <w:spacing w:after="200" w:before="420"/>
-      </w:pPr>
-      <w:r>
-        <w:rPr>
-          <w:rFonts w:ascii="Calibri" w:cs="Calibri" w:eastAsia="Calibri" w:hAnsi="Calibri"/>
-          <w:b/>
-          <w:bCs/>
-          <w:caps/>
-          <w:color w:val="453C79"/>
-          <w:sz w:val="28"/>
-          <w:szCs w:val="28"/>
-        </w:rPr>
-        <w:t xml:space="preserve">A Few Quick Questions</w:t>
-      </w:r>
-    </w:p>
-    <w:p>
-      <w:pPr>
-        <w:spacing w:after="100" w:line="264"/>
-      </w:pPr>
-      <w:r>
-        <w:rPr>
-          <w:rFonts w:ascii="Calibri" w:cs="Calibri" w:eastAsia="Calibri" w:hAnsi="Calibri"/>
-          <w:color w:val="453C79"/>
-          <w:sz w:val="23"/>
-          <w:szCs w:val="23"/>
-        </w:rPr>
-        <w:t xml:space="preserve">☐  </w:t>
-      </w:r>
-      <w:r>
-        <w:rPr>
-          <w:rFonts w:ascii="Calibri" w:cs="Calibri" w:eastAsia="Calibri" w:hAnsi="Calibri"/>
-          <w:b/>
-          <w:bCs/>
-          <w:color w:val="222222"/>
-          <w:sz w:val="21"/>
-          <w:szCs w:val="21"/>
-        </w:rPr>
-        <w:t xml:space="preserve">Do you use a call tracking service?</w:t>
-      </w:r>
-      <w:r>
-        <w:rPr>
-          <w:rFonts w:ascii="Calibri" w:cs="Calibri" w:eastAsia="Calibri" w:hAnsi="Calibri"/>
-          <w:i/>
-          <w:iCs/>
-          <w:color w:val="666666"/>
-          <w:sz w:val="19"/>
-          <w:szCs w:val="19"/>
-        </w:rPr>
-        <w:t xml:space="preserve">  —  e.g. CallRail — needed for Ads conversion tracking if we move forward with Paid Search</w:t>
-      </w:r>
-    </w:p>
-    <w:p>
-      <w:pPr>
-        <w:spacing w:after="100" w:line="264"/>
-      </w:pPr>
-      <w:r>
-        <w:rPr>
-          <w:rFonts w:ascii="Calibri" w:cs="Calibri" w:eastAsia="Calibri" w:hAnsi="Calibri"/>
-          <w:color w:val="453C79"/>
-          <w:sz w:val="23"/>
-          <w:szCs w:val="23"/>
-        </w:rPr>
-        <w:t xml:space="preserve">☐  </w:t>
-      </w:r>
-      <w:r>
-        <w:rPr>
-          <w:rFonts w:ascii="Calibri" w:cs="Calibri" w:eastAsia="Calibri" w:hAnsi="Calibri"/>
-          <w:b/>
-          <w:bCs/>
-          <w:color w:val="222222"/>
-          <w:sz w:val="21"/>
-          <w:szCs w:val="21"/>
-        </w:rPr>
-        <w:t xml:space="preserve">Who currently manages your Google Business Profile and Ads account?</w:t>
-      </w:r>
-      <w:r>
-        <w:rPr>
-          <w:rFonts w:ascii="Calibri" w:cs="Calibri" w:eastAsia="Calibri" w:hAnsi="Calibri"/>
-          <w:i/>
-          <w:iCs/>
-          <w:color w:val="666666"/>
-          <w:sz w:val="19"/>
-          <w:szCs w:val="19"/>
-        </w:rPr>
-        <w:t xml:space="preserve">  —  you, your current vendor, or someone else — helps us route requests correctly</w:t>
-      </w:r>
-    </w:p>
-    <w:p>
-      <w:pPr>
-        <w:spacing w:after="100" w:line="264"/>
-      </w:pPr>
-      <w:r>
-        <w:rPr>
-          <w:rFonts w:ascii="Calibri" w:cs="Calibri" w:eastAsia="Calibri" w:hAnsi="Calibri"/>
-          <w:color w:val="453C79"/>
-          <w:sz w:val="23"/>
-          <w:szCs w:val="23"/>
-        </w:rPr>
-        <w:t xml:space="preserve">☐  </w:t>
-      </w:r>
-      <w:r>
-        <w:rPr>
-          <w:rFonts w:ascii="Calibri" w:cs="Calibri" w:eastAsia="Calibri" w:hAnsi="Calibri"/>
-          <w:b/>
-          <w:bCs/>
-          <w:color w:val="222222"/>
-          <w:sz w:val="21"/>
-          <w:szCs w:val="21"/>
-        </w:rPr>
-        <w:t xml:space="preserve">What SEO plugin does your site use?</w:t>
-      </w:r>
-      <w:r>
-        <w:rPr>
-          <w:rFonts w:ascii="Calibri" w:cs="Calibri" w:eastAsia="Calibri" w:hAnsi="Calibri"/>
-          <w:i/>
-          <w:iCs/>
-          <w:color w:val="666666"/>
-          <w:sz w:val="19"/>
-          <w:szCs w:val="19"/>
-        </w:rPr>
-        <w:t xml:space="preserve">  —  Yoast, RankMath, etc. — informational, helps us work within your existing setup</w:t>
-      </w:r>
-    </w:p>
-    <w:p>
-      <w:pPr>
-        <w:pStyle w:val="Heading1"/>
-        <w:pBdr>
-          <w:bottom w:val="single" w:color="453C79" w:sz="6" w:space="6"/>
-        </w:pBdr>
-        <w:spacing w:after="200" w:before="420"/>
-      </w:pPr>
-      <w:r>
-        <w:rPr>
-          <w:rFonts w:ascii="Calibri" w:cs="Calibri" w:eastAsia="Calibri" w:hAnsi="Calibri"/>
-          <w:b/>
-          <w:bCs/>
-          <w:caps/>
-          <w:color w:val="453C79"/>
-          <w:sz w:val="28"/>
-          <w:szCs w:val="28"/>
-        </w:rPr>
-        <w:t xml:space="preserve">What's Already Handled</w:t>
-      </w:r>
-    </w:p>
-    <w:p>
-      <w:pPr>
-        <w:spacing w:after="140" w:line="276"/>
-      </w:pPr>
-      <w:r>
-        <w:rPr>
-          <w:rFonts w:ascii="Calibri" w:cs="Calibri" w:eastAsia="Calibri" w:hAnsi="Calibri"/>
-          <w:color w:val="222222"/>
-          <w:sz w:val="21"/>
-          <w:szCs w:val="21"/>
-        </w:rPr>
-        <w:t xml:space="preserve">You don't need to provide anything for these — we've got it:</w:t>
-      </w:r>
-    </w:p>
-    <w:p>
-      <w:pPr>
-        <w:spacing w:after="100"/>
-      </w:pPr>
-      <w:r>
-        <w:rPr>
-          <w:rFonts w:ascii="Calibri" w:cs="Calibri" w:eastAsia="Calibri" w:hAnsi="Calibri"/>
-          <w:color w:val="222222"/>
-          <w:sz w:val="20"/>
-          <w:szCs w:val="20"/>
-        </w:rPr>
-        <w:t xml:space="preserve">•  Content or copywriting — we're not rebuilding pages, this is SEO + Ads work within your existing site</w:t>
-      </w:r>
-    </w:p>
-    <w:p>
-      <w:pPr>
-        <w:spacing w:after="100"/>
-      </w:pPr>
-      <w:r>
-        <w:rPr>
-          <w:rFonts w:ascii="Calibri" w:cs="Calibri" w:eastAsia="Calibri" w:hAnsi="Calibri"/>
-          <w:color w:val="222222"/>
-          <w:sz w:val="20"/>
-          <w:szCs w:val="20"/>
-        </w:rPr>
-        <w:t xml:space="preserve">•  Design or page redesign — not in scope for this engagement</w:t>
-      </w:r>
-    </w:p>
-    <w:p>
-      <w:pPr>
-        <w:spacing w:after="300"/>
-      </w:pPr>
-      <w:r>
-        <w:rPr>
-          <w:rFonts w:ascii="Calibri" w:cs="Calibri" w:eastAsia="Calibri" w:hAnsi="Calibri"/>
-          <w:color w:val="222222"/>
-          <w:sz w:val="20"/>
-          <w:szCs w:val="20"/>
-        </w:rPr>
-        <w:t xml:space="preserve">•  Ad creative or campaign structure — we handle this once Google Ads access is granted</w:t>
-      </w:r>
-    </w:p>
     <w:tbl>
       <w:tblPr>
         <w:tblW w:type="dxa" w:w="10080"/>
@@ -977,12 +771,12 @@
     <w:tblPr>
       <w:tblW w:type="dxa" w:w="10080"/>
       <w:tblBorders>
-        <w:top w:val="single" w:color="auto" w:sz="4"/>
-        <w:left w:val="single" w:color="auto" w:sz="4"/>
-        <w:bottom w:val="single" w:color="auto" w:sz="4"/>
-        <w:right w:val="single" w:color="auto" w:sz="4"/>
-        <w:insideH w:val="single" w:color="auto" w:sz="4"/>
-        <w:insideV w:val="single" w:color="auto" w:sz="4"/>
+        <w:top w:val="none"/>
+        <w:left w:val="none"/>
+        <w:bottom w:val="none"/>
+        <w:right w:val="none"/>
+        <w:insideH w:val="none"/>
+        <w:insideV w:val="none"/>
       </w:tblBorders>
     </w:tblPr>
     <w:tblGrid>

</xml_diff>